<commit_message>
Demo local, base propia para los tests y decisiones del 27/09 en el documento
- scripts/demo.ts crea una clínica verificada y una dueña con dos mascotas
  para enseñar el producto en local (pnpm --filter @barkandmeow/api demo).
- test/entorno.ts apunta los tests a una base _test, que crea y migra, para
  no vaciar la de desarrollo.
- El documento recoge el perfil público en el nivel 0, el alta de clínica
  sin dominio, el registro del chip en dos pasos y los avisos sellados.

Co-Authored-By: Claude Opus 5.5 <noreply@anthropic.com>
</commit_message>
<xml_diff>
--- a/barkandmeow-arquitectura.docx
+++ b/barkandmeow-arquitectura.docx
@@ -868,10 +868,7 @@
               <w:t xml:space="preserve">“Existe ficha”</w:t>
             </w:r>
             <w:r>
-              <w:t xml:space="preserve"> </w:t>
-            </w:r>
-            <w:r>
-              <w:t xml:space="preserve">+ botón para avisar al dueño</w:t>
+              <w:t xml:space="preserve">, el perfil público si el dueño lo publicó (foto, bio, teléfonos) + botón para avisar al dueño</w:t>
             </w:r>
           </w:p>
         </w:tc>
@@ -6272,7 +6269,7 @@
         </w:numPr>
       </w:pPr>
       <w:r>
-        <w:t xml:space="preserve">Los avisos al dueño usan un token de notificación push; nunca se muestra su teléfono ni su email en el nivel 0.</w:t>
+        <w:t xml:space="preserve">Los avisos al dueño van sellados en el navegador del veterinario para la clave pública del dueño y esperan en su bandeja; el aviso push al móvil está pendiente. El nivel 0 nunca muestra el email del dueño, y solo muestra teléfonos si el dueño los publicó en su perfil público (decidido 2026-09-27: el perfil público es visible por placa, por número de chip y dentro de la ficha).</w:t>
       </w:r>
     </w:p>
     <w:p>

</xml_diff>

<commit_message>
Recordatorios de viaje en el calendario y registros sin duplicar
- El pasaporte genera en el navegador un .ics con las fechas que no se
  pueden pasar: renovar la rabia, la franja de la tenia, los 21 días de
  espera y la víspera del viaje. El servidor sigue sin saber nada.
- Un registro firmado que llega dos veces cuenta una, y los repetidos ya
  guardados se limpian al abrir el pasaporte.
- packages/schema importa sin extensión: Turbopack no resolvía los .js del
  índice y el pasaporte del portal no llegaba a compilar en el navegador.
- En el teléfono, el destino del viaje va a todo el ancho.

Co-Authored-By: Claude Opus 5.5 <noreply@anthropic.com>
</commit_message>
<xml_diff>
--- a/barkandmeow-arquitectura.docx
+++ b/barkandmeow-arquitectura.docx
@@ -13490,7 +13490,50 @@
         </w:numPr>
       </w:pPr>
       <w:r>
-        <w:t xml:space="preserve">Pendiente: recordatorios de plazos y guardar escaneado el pasaporte de papel como documento original.</w:t>
+        <w:rPr>
+          <w:b/>
+          <w:bCs/>
+        </w:rPr>
+        <w:t xml:space="preserve">Recordatorios de plazos</w:t>
+      </w:r>
+      <w:r>
+        <w:t xml:space="preserve"> </w:t>
+      </w:r>
+      <w:r>
+        <w:t xml:space="preserve">en un archivo de calendario (</w:t>
+      </w:r>
+      <w:r>
+        <w:rPr>
+          <w:rStyle w:val="VerbatimChar"/>
+        </w:rPr>
+        <w:t xml:space="preserve">.ics</w:t>
+      </w:r>
+      <w:r>
+        <w:t xml:space="preserve">) que se genera en el navegador: renovar la rabia 30 días antes de que caduque, la franja de la tenia, el fin de los 21 días de espera y la víspera del viaje. El servidor no puede avisar por su cuenta porque no sabe nada del pasaporte, y así tampoco hace falta.</w:t>
+      </w:r>
+    </w:p>
+    <w:p>
+      <w:pPr>
+        <w:pStyle w:val="Compact"/>
+        <w:numPr>
+          <w:ilvl w:val="0"/>
+          <w:numId w:val="1023"/>
+        </w:numPr>
+      </w:pPr>
+      <w:r>
+        <w:t xml:space="preserve">Un mismo registro firmado que llega dos veces (un reintento del software de gestión) cuenta una.</w:t>
+      </w:r>
+    </w:p>
+    <w:p>
+      <w:pPr>
+        <w:pStyle w:val="Compact"/>
+        <w:numPr>
+          <w:ilvl w:val="0"/>
+          <w:numId w:val="1023"/>
+        </w:numPr>
+      </w:pPr>
+      <w:r>
+        <w:t xml:space="preserve">Pendiente: guardar escaneado el pasaporte de papel como documento original.</w:t>
       </w:r>
     </w:p>
     <w:p>

</xml_diff>

<commit_message>
Recuperar la contraseña: papel y segundo factor para dueños, correo para clínicas
- Dueño: firma un reto con una clave Ed25519 que sale de la de su código en
  papel (el servidor solo guarda la pública y verifica con node:crypto) y
  después recibe un código por correo o SMS. Quien robe el correo no puede
  quedarse la cuenta.
- Miembro de clínica: código al correo; la respuesta no dice si hay cuenta.
- Al cambiarla se cierran todas las sesiones y llega un aviso al correo.
- Las cuentas anteriores guardan su clave de recuperación una sola vez desde
  un navegador o móvil que ya tenga la clave (PUT /owners/v1/recovery-key).
- Páginas /recuperar en el portal y en la clínica; la app abre la del portal.
- Migración 0012 (tabla recuperaciones, owners.recovery_pub), 6 rutas en el
  catálogo, openapi.yaml regenerado, tests de API y de paridad de claves.

Co-Authored-By: Claude Opus 5.5 <noreply@anthropic.com>
</commit_message>
<xml_diff>
--- a/barkandmeow-arquitectura.docx
+++ b/barkandmeow-arquitectura.docx
@@ -7426,6 +7426,81 @@
       </w:pPr>
       <w:r>
         <w:t xml:space="preserve">Código de recuperación de 24 palabras en papel y, opcionalmente, un segundo dispositivo (por ejemplo, el móvil de otro miembro de la familia) como copia de la clave.</w:t>
+      </w:r>
+    </w:p>
+    <w:p>
+      <w:pPr>
+        <w:pStyle w:val="BodyText"/>
+      </w:pPr>
+      <w:r>
+        <w:rPr>
+          <w:b/>
+          <w:bCs/>
+        </w:rPr>
+        <w:t xml:space="preserve">Contraseña olvidada</w:t>
+      </w:r>
+      <w:r>
+        <w:t xml:space="preserve"> </w:t>
+      </w:r>
+      <w:r>
+        <w:t xml:space="preserve">(decidido 2026-09-30). La contraseña no protege datos, solo la entrada: cambiarla no descifra ni pierde nada. Para el dueño hacen falta dos cosas. La primera es su código en papel: de su clave sale un par Ed25519 de recuperación, el servidor guarda solo la pública (</w:t>
+      </w:r>
+      <w:r>
+        <w:rPr>
+          <w:rStyle w:val="VerbatimChar"/>
+        </w:rPr>
+        <w:t xml:space="preserve">owners.recovery_pub</w:t>
+      </w:r>
+      <w:r>
+        <w:t xml:space="preserve">) y el dueño firma un reto (</w:t>
+      </w:r>
+      <w:r>
+        <w:rPr>
+          <w:rStyle w:val="VerbatimChar"/>
+        </w:rPr>
+        <w:t xml:space="preserve">/owners/v1/recovery</w:t>
+      </w:r>
+      <w:r>
+        <w:t xml:space="preserve">,</w:t>
+      </w:r>
+      <w:r>
+        <w:t xml:space="preserve"> </w:t>
+      </w:r>
+      <w:r>
+        <w:rPr>
+          <w:rStyle w:val="VerbatimChar"/>
+        </w:rPr>
+        <w:t xml:space="preserve">/proof</w:t>
+      </w:r>
+      <w:r>
+        <w:t xml:space="preserve">). La segunda es el código de su segundo factor, por correo o SMS (</w:t>
+      </w:r>
+      <w:r>
+        <w:rPr>
+          <w:rStyle w:val="VerbatimChar"/>
+        </w:rPr>
+        <w:t xml:space="preserve">/finish</w:t>
+      </w:r>
+      <w:r>
+        <w:t xml:space="preserve">). Quien robe el correo no puede quedarse la cuenta; quien pierda el papel tiene la reclamación del chip en una clínica. Los miembros de una clínica recuperan con un código al correo (</w:t>
+      </w:r>
+      <w:r>
+        <w:rPr>
+          <w:rStyle w:val="VerbatimChar"/>
+        </w:rPr>
+        <w:t xml:space="preserve">/clinics/v1/recovery</w:t>
+      </w:r>
+      <w:r>
+        <w:t xml:space="preserve">), porque la clave de la clínica no depende de la contraseña. En los dos casos se cierran todas las sesiones y llega un aviso al correo. Las cuentas de dueño anteriores guardan su clave de recuperación una sola vez, desde un navegador o un móvil que ya tenga la clave (</w:t>
+      </w:r>
+      <w:r>
+        <w:rPr>
+          <w:rStyle w:val="VerbatimChar"/>
+        </w:rPr>
+        <w:t xml:space="preserve">PUT /owners/v1/recovery-key</w:t>
+      </w:r>
+      <w:r>
+        <w:t xml:space="preserve">).</w:t>
       </w:r>
     </w:p>
     <w:bookmarkEnd w:id="16"/>

</xml_diff>